<commit_message>
Add Lab 4 (DFD, ABC, reports) and Lab 5 (UML); fix Lab 3 A0 layout
- tools/idef_model.py: DFD (Gane–Sarson, off-page references), ABC Data on
  IDEF0 boxes, deterministic UML use-case renderer; label placer: wider
  search, leader lines may not cross boxes; IDEF0 box/gap rebalanced
- tools/puml_render.py: PlantUML renderer with legibility gate (jar not
  committed, see tools/plantuml/README.md)
- lab4/: DFD A4/A5, ABC roll-up, Activity Cost Report, UDP and model
  reports, ЛР4_Кравченко_ІР-31.docx
- lab5/: use case ×2, activity ×2, sequence, class ×2,
  ЛР5_Кравченко_ІР-31.docx
- lab3: A0 label no longer overlaps box A4; report rebuilt
- check_report: User Defined Properties allowed, ranged table references
- briefs лб4, лб5_6, лб7 and Заява.docx added

Co-Authored-By: Claude Opus 5.5 <noreply@anthropic.com>
</commit_message>
<xml_diff>
--- a/lab3/ЛР3_Кравченко_ІР-31.docx
+++ b/lab3/ЛР3_Кравченко_ІР-31.docx
@@ -8166,7 +8166,7 @@
       <w:r>
         <w:drawing>
           <wp:inline xmlns:pic="http://schemas.openxmlformats.org/drawingml/2006/picture">
-            <wp:extent cx="9118800" cy="5220428"/>
+            <wp:extent cx="9082800" cy="5219221"/>
             <wp:docPr id="7" name="Picture 7"/>
             <wp:cNvGraphicFramePr>
               <a:graphicFrameLocks noChangeAspect="1"/>
@@ -8187,7 +8187,7 @@
                   <pic:spPr>
                     <a:xfrm>
                       <a:off x="0" y="0"/>
-                      <a:ext cx="9118800" cy="5220428"/>
+                      <a:ext cx="9082800" cy="5219221"/>
                     </a:xfrm>
                     <a:prstGeom prst="rect"/>
                   </pic:spPr>

</xml_diff>